<commit_message>
Illustrated Windcraft info sheet; wind readout fits on phones
- Info sheet rewritten around what matters to multihull sailors, with live
  screenshots (monohull vs catamaran score and sea-state map, tap readout,
  Captain's Brief) and the free-access offer last.
- md2docx: ![caption](path) images, side by side when on one line.
- Wind Map readout stacks or wraps so it no longer runs off a 375 px screen.

Co-Authored-By: Claude Opus 5.5 <noreply@anthropic.com>
</commit_message>
<xml_diff>
--- a/docs/Ask-Captain-Jim-Info-Sheet.docx
+++ b/docs/Ask-Captain-Jim-Info-Sheet.docx
@@ -7,7 +7,7 @@
         <w:pStyle w:val="Heading1"/>
       </w:pPr>
       <w:r>
-        <w:t>Ask Captain Jim — App Info Sheet</w:t>
+        <w:t>Ask Captain Jim — What's New for Multihull Sailors</w:t>
       </w:r>
     </w:p>
     <w:p>
@@ -15,21 +15,12 @@
         <w:rPr>
           <w:b/>
         </w:rPr>
-        <w:t>Gulf Edition · askcaptainjim.com · Prepared for Windcraft Multihulls, October 2026</w:t>
+        <w:t>Prepared for Tommy Clark, Windcraft Multihulls · October 2026 · askcaptainjim.com</w:t>
       </w:r>
     </w:p>
     <w:p>
       <w:r>
-        <w:t xml:space="preserve">Ask Captain Jim is not another weather app. It answers the question every skipper asks first: </w:t>
-      </w:r>
-      <w:r>
-        <w:rPr>
-          <w:i/>
-        </w:rPr>
-        <w:t>is today a good day to sail, and when?</w:t>
-      </w:r>
-      <w:r>
-        <w:t xml:space="preserve"> It reads live government and marine forecasts, applies your own limits and your boat type, and gives you a single score and the best departure and return times.</w:t>
+        <w:t>Tommy, you said Ask Captain Jim fits the "Average Joe," the family weekend sailor and the beginner-to-intermediate skipper. So everything below was built for exactly those customers, and especially for the ones on cats and tris. It's all live today. The screenshots are real, taken from the app on a phone this afternoon.</w:t>
       </w:r>
     </w:p>
     <w:p>
@@ -37,7 +28,93 @@
         <w:pStyle w:val="Heading2"/>
       </w:pPr>
       <w:r>
-        <w:t>At a glance</w:t>
+        <w:t>1. The app now knows what boat you sail</w:t>
+      </w:r>
+    </w:p>
+    <w:p>
+      <w:r>
+        <w:t xml:space="preserve">In Sailing Preferences, a new </w:t>
+      </w:r>
+      <w:r>
+        <w:rPr>
+          <w:b/>
+        </w:rPr>
+        <w:t>Boat Type</w:t>
+      </w:r>
+      <w:r>
+        <w:t xml:space="preserve"> setting: </w:t>
+      </w:r>
+      <w:r>
+        <w:rPr>
+          <w:b/>
+        </w:rPr>
+        <w:t>Monohull, Catamaran, Trimaran or Beach Cat</w:t>
+      </w:r>
+      <w:r>
+        <w:t>. Pick one and the whole app reads the same forecast the way that boat experiences it.</w:t>
+      </w:r>
+    </w:p>
+    <w:p>
+      <w:pPr>
+        <w:jc w:val="center"/>
+      </w:pPr>
+      <w:r>
+        <w:drawing>
+          <wp:inline xmlns:a="http://schemas.openxmlformats.org/drawingml/2006/main" xmlns:pic="http://schemas.openxmlformats.org/drawingml/2006/picture">
+            <wp:extent cx="1828800" cy="3959352"/>
+            <wp:docPr id="1" name="Picture 1"/>
+            <wp:cNvGraphicFramePr>
+              <a:graphicFrameLocks noChangeAspect="1"/>
+            </wp:cNvGraphicFramePr>
+            <a:graphic>
+              <a:graphicData uri="http://schemas.openxmlformats.org/drawingml/2006/picture">
+                <pic:pic>
+                  <pic:nvPicPr>
+                    <pic:cNvPr id="0" name="prefs-boat-type.jpg"/>
+                    <pic:cNvPicPr/>
+                  </pic:nvPicPr>
+                  <pic:blipFill>
+                    <a:blip r:embed="rId9"/>
+                    <a:stretch>
+                      <a:fillRect/>
+                    </a:stretch>
+                  </pic:blipFill>
+                  <pic:spPr>
+                    <a:xfrm>
+                      <a:off x="0" y="0"/>
+                      <a:ext cx="1828800" cy="3959352"/>
+                    </a:xfrm>
+                    <a:prstGeom prst="rect"/>
+                  </pic:spPr>
+                </pic:pic>
+              </a:graphicData>
+            </a:graphic>
+          </wp:inline>
+        </w:drawing>
+      </w:r>
+    </w:p>
+    <w:p>
+      <w:pPr>
+        <w:jc w:val="center"/>
+      </w:pPr>
+      <w:r>
+        <w:rPr>
+          <w:i/>
+          <w:color w:val="555555"/>
+          <w:sz w:val="18"/>
+        </w:rPr>
+        <w:t>Boat Type is the second setting in Sailing Preferences</w:t>
+      </w:r>
+    </w:p>
+    <w:p>
+      <w:r>
+        <w:rPr>
+          <w:b/>
+        </w:rPr>
+        <w:t>Why it matters:</w:t>
+      </w:r>
+      <w:r>
+        <w:t xml:space="preserve"> a monohull heels and spills a gust, so the skipper feels it coming. A multihull stays flat and takes the full load. And a catamaran's bridgedeck pounds in short, steep chop that a monohull shrugs off. So for multihulls the app now:</w:t>
       </w:r>
     </w:p>
     <w:p>
@@ -48,10 +125,10 @@
         <w:rPr>
           <w:b/>
         </w:rPr>
-        <w:t>Works on any phone, tablet or computer.</w:t>
+        <w:t>Watches the gap between wind and gusts more closely.</w:t>
       </w:r>
       <w:r>
-        <w:t xml:space="preserve"> Nothing to install: open askcaptainjim.com in a browser, or save it to the home screen like an app.</w:t>
+        <w:t xml:space="preserve"> A big gust spread lowers a multihull's score sooner and harder, and a reason tag says "Gusty for a catamaran."</w:t>
       </w:r>
     </w:p>
     <w:p>
@@ -62,10 +139,19 @@
         <w:rPr>
           <w:b/>
         </w:rPr>
-        <w:t>Covers the whole Gulf:</w:t>
+        <w:t>Weighs choppy seas more heavily.</w:t>
       </w:r>
       <w:r>
-        <w:t xml:space="preserve"> Texas to the Florida Keys, plus both Florida coasts.</w:t>
+        <w:t xml:space="preserve"> Wave height </w:t>
+      </w:r>
+      <w:r>
+        <w:rPr>
+          <w:i/>
+        </w:rPr>
+        <w:t>and</w:t>
+      </w:r>
+      <w:r>
+        <w:t xml:space="preserve"> how close together the waves come now count in the score.</w:t>
       </w:r>
     </w:p>
     <w:p>
@@ -76,10 +162,181 @@
         <w:rPr>
           <w:b/>
         </w:rPr>
-        <w:t>7-day free trial</w:t>
+        <w:t>Sets a no-go wind limit for each boat:</w:t>
       </w:r>
       <w:r>
-        <w:t>, then $5.99 a month or $49 a year.</w:t>
+        <w:t xml:space="preserve"> 26 kt for a monohull or cruising cat, 24 kt for a trimaran, 20 kt for a beach cat (which is also a no-go in 4 ft seas).</w:t>
+      </w:r>
+    </w:p>
+    <w:p>
+      <w:pPr>
+        <w:pStyle w:val="Heading2"/>
+      </w:pPr>
+      <w:r>
+        <w:t>2. Same forecast, different boat: a real example from today</w:t>
+      </w:r>
+    </w:p>
+    <w:p>
+      <w:r>
+        <w:t xml:space="preserve">Galveston, this afternoon: 15 kt, with 2.7 ft seas coming every 4 seconds. A monohull scores </w:t>
+      </w:r>
+      <w:r>
+        <w:rPr>
+          <w:b/>
+        </w:rPr>
+        <w:t>8.0</w:t>
+      </w:r>
+      <w:r>
+        <w:t xml:space="preserve">. A catamaran scores </w:t>
+      </w:r>
+      <w:r>
+        <w:rPr>
+          <w:b/>
+        </w:rPr>
+        <w:t>7.3</w:t>
+      </w:r>
+      <w:r>
+        <w:t xml:space="preserve">, and the app tells the skipper why: </w:t>
+      </w:r>
+      <w:r>
+        <w:rPr>
+          <w:i/>
+        </w:rPr>
+        <w:t>"short, steep chop for a catamaran."</w:t>
+      </w:r>
+    </w:p>
+    <w:tbl>
+      <w:tblPr>
+        <w:tblW w:type="auto" w:w="0"/>
+        <w:tblLook w:firstColumn="1" w:firstRow="1" w:lastColumn="0" w:lastRow="0" w:noHBand="0" w:noVBand="1" w:val="04A0"/>
+      </w:tblPr>
+      <w:tblGrid>
+        <w:gridCol w:w="4320"/>
+        <w:gridCol w:w="4320"/>
+      </w:tblGrid>
+      <w:tr>
+        <w:tc>
+          <w:tcPr>
+            <w:tcW w:type="dxa" w:w="4320"/>
+          </w:tcPr>
+          <w:p>
+            <w:pPr>
+              <w:jc w:val="center"/>
+            </w:pPr>
+            <w:r>
+              <w:drawing>
+                <wp:inline xmlns:a="http://schemas.openxmlformats.org/drawingml/2006/main" xmlns:pic="http://schemas.openxmlformats.org/drawingml/2006/picture">
+                  <wp:extent cx="1965960" cy="4256303"/>
+                  <wp:docPr id="2" name="Picture 2"/>
+                  <wp:cNvGraphicFramePr>
+                    <a:graphicFrameLocks noChangeAspect="1"/>
+                  </wp:cNvGraphicFramePr>
+                  <a:graphic>
+                    <a:graphicData uri="http://schemas.openxmlformats.org/drawingml/2006/picture">
+                      <pic:pic>
+                        <pic:nvPicPr>
+                          <pic:cNvPr id="0" name="score-mono.jpg"/>
+                          <pic:cNvPicPr/>
+                        </pic:nvPicPr>
+                        <pic:blipFill>
+                          <a:blip r:embed="rId10"/>
+                          <a:stretch>
+                            <a:fillRect/>
+                          </a:stretch>
+                        </pic:blipFill>
+                        <pic:spPr>
+                          <a:xfrm>
+                            <a:off x="0" y="0"/>
+                            <a:ext cx="1965960" cy="4256303"/>
+                          </a:xfrm>
+                          <a:prstGeom prst="rect"/>
+                        </pic:spPr>
+                      </pic:pic>
+                    </a:graphicData>
+                  </a:graphic>
+                </wp:inline>
+              </w:drawing>
+            </w:r>
+          </w:p>
+          <w:p>
+            <w:pPr>
+              <w:jc w:val="center"/>
+            </w:pPr>
+            <w:r>
+              <w:rPr>
+                <w:i/>
+                <w:color w:val="555555"/>
+                <w:sz w:val="18"/>
+              </w:rPr>
+              <w:t>Monohull: 8.0</w:t>
+            </w:r>
+          </w:p>
+        </w:tc>
+        <w:tc>
+          <w:tcPr>
+            <w:tcW w:type="dxa" w:w="4320"/>
+          </w:tcPr>
+          <w:p>
+            <w:pPr>
+              <w:jc w:val="center"/>
+            </w:pPr>
+            <w:r>
+              <w:drawing>
+                <wp:inline xmlns:a="http://schemas.openxmlformats.org/drawingml/2006/main" xmlns:pic="http://schemas.openxmlformats.org/drawingml/2006/picture">
+                  <wp:extent cx="1965960" cy="4256303"/>
+                  <wp:docPr id="3" name="Picture 3"/>
+                  <wp:cNvGraphicFramePr>
+                    <a:graphicFrameLocks noChangeAspect="1"/>
+                  </wp:cNvGraphicFramePr>
+                  <a:graphic>
+                    <a:graphicData uri="http://schemas.openxmlformats.org/drawingml/2006/picture">
+                      <pic:pic>
+                        <pic:nvPicPr>
+                          <pic:cNvPr id="0" name="score-cat.jpg"/>
+                          <pic:cNvPicPr/>
+                        </pic:nvPicPr>
+                        <pic:blipFill>
+                          <a:blip r:embed="rId11"/>
+                          <a:stretch>
+                            <a:fillRect/>
+                          </a:stretch>
+                        </pic:blipFill>
+                        <pic:spPr>
+                          <a:xfrm>
+                            <a:off x="0" y="0"/>
+                            <a:ext cx="1965960" cy="4256303"/>
+                          </a:xfrm>
+                          <a:prstGeom prst="rect"/>
+                        </pic:spPr>
+                      </pic:pic>
+                    </a:graphicData>
+                  </a:graphic>
+                </wp:inline>
+              </w:drawing>
+            </w:r>
+          </w:p>
+          <w:p>
+            <w:pPr>
+              <w:jc w:val="center"/>
+            </w:pPr>
+            <w:r>
+              <w:rPr>
+                <w:i/>
+                <w:color w:val="555555"/>
+                <w:sz w:val="18"/>
+              </w:rPr>
+              <w:t>Catamaran: 7.3, with the chop warning</w:t>
+            </w:r>
+          </w:p>
+        </w:tc>
+      </w:tr>
+    </w:tbl>
+    <w:p>
+      <w:r>
+        <w:rPr>
+          <w:b/>
+        </w:rPr>
+        <w:t>What each hull type gets:</w:t>
       </w:r>
     </w:p>
     <w:p>
@@ -90,18 +347,10 @@
         <w:rPr>
           <w:b/>
         </w:rPr>
-        <w:t>Built for everyday sailors:</w:t>
+        <w:t>Catamaran (Seawind and other cruising cats):</w:t>
       </w:r>
       <w:r>
-        <w:t xml:space="preserve"> weekend and family sailors, beginners and intermediates, and new boat owners who want a clear answer rather than a pile of forecast models.</w:t>
-      </w:r>
-    </w:p>
-    <w:p>
-      <w:pPr>
-        <w:pStyle w:val="Heading2"/>
-      </w:pPr>
-      <w:r>
-        <w:t>Core features</w:t>
+        <w:t xml:space="preserve"> stricter about gusts; waves count 1.5 times as much; no-go above 26 kt.</w:t>
       </w:r>
     </w:p>
     <w:p>
@@ -112,10 +361,10 @@
         <w:rPr>
           <w:b/>
         </w:rPr>
-        <w:t>Sailing Window score (0–10).</w:t>
+        <w:t>Trimaran (Corsair, Dragonfly):</w:t>
       </w:r>
       <w:r>
-        <w:t xml:space="preserve"> Each daylight hour is scored against your preferences. The app then finds the best block for your trip length and labels it Excellent, Good, Marginal or No-Go. Below the score, plain-English reason tags explain it, for example "Gusts 18 kt — near your limit" or "Seas 2.2 ft every 4 s — short, steep chop."</w:t>
+        <w:t xml:space="preserve"> the same stricter gust handling; waves count 1.3 times as much; no-go above 24 kt.</w:t>
       </w:r>
     </w:p>
     <w:p>
@@ -126,10 +375,10 @@
         <w:rPr>
           <w:b/>
         </w:rPr>
-        <w:t>Best departure and return times</w:t>
+        <w:t>Beach Cat:</w:t>
       </w:r>
       <w:r>
-        <w:t xml:space="preserve"> for the trip length you choose (1 to 12 hours).</w:t>
+        <w:t xml:space="preserve"> the strictest of all; waves count twice as much; no-go above 20 kt or in 4 ft seas. Choosing it also suggests gentler limits (6–15 kt, 18 kt maximum gust).</w:t>
       </w:r>
     </w:p>
     <w:p>
@@ -140,10 +389,487 @@
         <w:rPr>
           <w:b/>
         </w:rPr>
-        <w:t>Your own limits:</w:t>
+        <w:t>Monohull:</w:t>
       </w:r>
       <w:r>
-        <w:t xml:space="preserve"> preferred wind range, maximum gust, trip length, tide preference (incoming, outgoing or any) and boat type.</w:t>
+        <w:t xml:space="preserve"> the baseline the app has always used.</w:t>
+      </w:r>
+    </w:p>
+    <w:p>
+      <w:r>
+        <w:t xml:space="preserve">The same 3 ft of sea scores very differently by </w:t>
+      </w:r>
+      <w:r>
+        <w:rPr>
+          <w:i/>
+        </w:rPr>
+        <w:t>period</w:t>
+      </w:r>
+      <w:r>
+        <w:t>: when the waves come 4 seconds apart a catamaran drops to 6.1, but in a gentle 9-second swell it holds at 7.6.</w:t>
+      </w:r>
+    </w:p>
+    <w:p>
+      <w:pPr>
+        <w:pStyle w:val="Heading2"/>
+      </w:pPr>
+      <w:r>
+        <w:t>3. The Wind Map: see where the slam zone is</w:t>
+      </w:r>
+    </w:p>
+    <w:p>
+      <w:r>
+        <w:t xml:space="preserve">Tap </w:t>
+      </w:r>
+      <w:r>
+        <w:rPr>
+          <w:b/>
+        </w:rPr>
+        <w:t>Wind</w:t>
+      </w:r>
+      <w:r>
+        <w:t xml:space="preserve"> in the bottom bar for three days of wind, gusts and waves across the coast. It opens right on your marina. For a multihull, the </w:t>
+      </w:r>
+      <w:r>
+        <w:rPr>
+          <w:b/>
+        </w:rPr>
+        <w:t>Waves</w:t>
+      </w:r>
+      <w:r>
+        <w:t xml:space="preserve"> layer becomes </w:t>
+      </w:r>
+      <w:r>
+        <w:rPr>
+          <w:b/>
+        </w:rPr>
+        <w:t>"Sea state for a catamaran"</w:t>
+      </w:r>
+      <w:r>
+        <w:t xml:space="preserve"> (or trimaran, or beach cat), so short, steep chop shows in </w:t>
+      </w:r>
+      <w:r>
+        <w:rPr>
+          <w:b/>
+        </w:rPr>
+        <w:t>orange: "bridgedeck slam."</w:t>
+      </w:r>
+    </w:p>
+    <w:p>
+      <w:r>
+        <w:t>Here's the same Galveston water as a monohull and as a catamaran sees it. The monohull map shows a moderate "2–4 ft" sea in yellow. The catamaran map shows the same water in orange.</w:t>
+      </w:r>
+    </w:p>
+    <w:tbl>
+      <w:tblPr>
+        <w:tblW w:type="auto" w:w="0"/>
+        <w:tblLook w:firstColumn="1" w:firstRow="1" w:lastColumn="0" w:lastRow="0" w:noHBand="0" w:noVBand="1" w:val="04A0"/>
+      </w:tblPr>
+      <w:tblGrid>
+        <w:gridCol w:w="4320"/>
+        <w:gridCol w:w="4320"/>
+      </w:tblGrid>
+      <w:tr>
+        <w:tc>
+          <w:tcPr>
+            <w:tcW w:type="dxa" w:w="4320"/>
+          </w:tcPr>
+          <w:p>
+            <w:pPr>
+              <w:jc w:val="center"/>
+            </w:pPr>
+            <w:r>
+              <w:drawing>
+                <wp:inline xmlns:a="http://schemas.openxmlformats.org/drawingml/2006/main" xmlns:pic="http://schemas.openxmlformats.org/drawingml/2006/picture">
+                  <wp:extent cx="1965960" cy="4256303"/>
+                  <wp:docPr id="4" name="Picture 4"/>
+                  <wp:cNvGraphicFramePr>
+                    <a:graphicFrameLocks noChangeAspect="1"/>
+                  </wp:cNvGraphicFramePr>
+                  <a:graphic>
+                    <a:graphicData uri="http://schemas.openxmlformats.org/drawingml/2006/picture">
+                      <pic:pic>
+                        <pic:nvPicPr>
+                          <pic:cNvPr id="0" name="map-waves-mono.jpg"/>
+                          <pic:cNvPicPr/>
+                        </pic:nvPicPr>
+                        <pic:blipFill>
+                          <a:blip r:embed="rId12"/>
+                          <a:stretch>
+                            <a:fillRect/>
+                          </a:stretch>
+                        </pic:blipFill>
+                        <pic:spPr>
+                          <a:xfrm>
+                            <a:off x="0" y="0"/>
+                            <a:ext cx="1965960" cy="4256303"/>
+                          </a:xfrm>
+                          <a:prstGeom prst="rect"/>
+                        </pic:spPr>
+                      </pic:pic>
+                    </a:graphicData>
+                  </a:graphic>
+                </wp:inline>
+              </w:drawing>
+            </w:r>
+          </w:p>
+          <w:p>
+            <w:pPr>
+              <w:jc w:val="center"/>
+            </w:pPr>
+            <w:r>
+              <w:rPr>
+                <w:i/>
+                <w:color w:val="555555"/>
+                <w:sz w:val="18"/>
+              </w:rPr>
+              <w:t>Monohull: wave height</w:t>
+            </w:r>
+          </w:p>
+        </w:tc>
+        <w:tc>
+          <w:tcPr>
+            <w:tcW w:type="dxa" w:w="4320"/>
+          </w:tcPr>
+          <w:p>
+            <w:pPr>
+              <w:jc w:val="center"/>
+            </w:pPr>
+            <w:r>
+              <w:drawing>
+                <wp:inline xmlns:a="http://schemas.openxmlformats.org/drawingml/2006/main" xmlns:pic="http://schemas.openxmlformats.org/drawingml/2006/picture">
+                  <wp:extent cx="1965960" cy="4256303"/>
+                  <wp:docPr id="5" name="Picture 5"/>
+                  <wp:cNvGraphicFramePr>
+                    <a:graphicFrameLocks noChangeAspect="1"/>
+                  </wp:cNvGraphicFramePr>
+                  <a:graphic>
+                    <a:graphicData uri="http://schemas.openxmlformats.org/drawingml/2006/picture">
+                      <pic:pic>
+                        <pic:nvPicPr>
+                          <pic:cNvPr id="0" name="map-waves-cat.jpg"/>
+                          <pic:cNvPicPr/>
+                        </pic:nvPicPr>
+                        <pic:blipFill>
+                          <a:blip r:embed="rId13"/>
+                          <a:stretch>
+                            <a:fillRect/>
+                          </a:stretch>
+                        </pic:blipFill>
+                        <pic:spPr>
+                          <a:xfrm>
+                            <a:off x="0" y="0"/>
+                            <a:ext cx="1965960" cy="4256303"/>
+                          </a:xfrm>
+                          <a:prstGeom prst="rect"/>
+                        </pic:spPr>
+                      </pic:pic>
+                    </a:graphicData>
+                  </a:graphic>
+                </wp:inline>
+              </w:drawing>
+            </w:r>
+          </w:p>
+          <w:p>
+            <w:pPr>
+              <w:jc w:val="center"/>
+            </w:pPr>
+            <w:r>
+              <w:rPr>
+                <w:i/>
+                <w:color w:val="555555"/>
+                <w:sz w:val="18"/>
+              </w:rPr>
+              <w:t>Catamaran: sea state, chop in orange</w:t>
+            </w:r>
+          </w:p>
+        </w:tc>
+      </w:tr>
+    </w:tbl>
+    <w:p>
+      <w:pPr>
+        <w:pStyle w:val="Heading3"/>
+      </w:pPr>
+      <w:r>
+        <w:t>Tap anywhere for instant details</w:t>
+      </w:r>
+    </w:p>
+    <w:p>
+      <w:r>
+        <w:t xml:space="preserve">On every layer (Wind, Gusts or Waves), </w:t>
+      </w:r>
+      <w:r>
+        <w:rPr>
+          <w:b/>
+        </w:rPr>
+        <w:t>one tap on any spot on the water</w:t>
+      </w:r>
+      <w:r>
+        <w:t xml:space="preserve"> shows that exact spot's wind and direction, gusts, wave height and how many seconds apart the waves are. Check the bay, the pass and offshore in three taps before leaving the dock.</w:t>
+      </w:r>
+    </w:p>
+    <w:p>
+      <w:pPr>
+        <w:jc w:val="center"/>
+      </w:pPr>
+      <w:r>
+        <w:drawing>
+          <wp:inline xmlns:a="http://schemas.openxmlformats.org/drawingml/2006/main" xmlns:pic="http://schemas.openxmlformats.org/drawingml/2006/picture">
+            <wp:extent cx="1828800" cy="3959352"/>
+            <wp:docPr id="6" name="Picture 6"/>
+            <wp:cNvGraphicFramePr>
+              <a:graphicFrameLocks noChangeAspect="1"/>
+            </wp:cNvGraphicFramePr>
+            <a:graphic>
+              <a:graphicData uri="http://schemas.openxmlformats.org/drawingml/2006/picture">
+                <pic:pic>
+                  <pic:nvPicPr>
+                    <pic:cNvPr id="0" name="map-tap.jpg"/>
+                    <pic:cNvPicPr/>
+                  </pic:nvPicPr>
+                  <pic:blipFill>
+                    <a:blip r:embed="rId14"/>
+                    <a:stretch>
+                      <a:fillRect/>
+                    </a:stretch>
+                  </pic:blipFill>
+                  <pic:spPr>
+                    <a:xfrm>
+                      <a:off x="0" y="0"/>
+                      <a:ext cx="1828800" cy="3959352"/>
+                    </a:xfrm>
+                    <a:prstGeom prst="rect"/>
+                  </pic:spPr>
+                </pic:pic>
+              </a:graphicData>
+            </a:graphic>
+          </wp:inline>
+        </w:drawing>
+      </w:r>
+    </w:p>
+    <w:p>
+      <w:pPr>
+        <w:jc w:val="center"/>
+      </w:pPr>
+      <w:r>
+        <w:rPr>
+          <w:i/>
+          <w:color w:val="555555"/>
+          <w:sz w:val="18"/>
+        </w:rPr>
+        <w:t>Tap readout: 11 kt SSE, gust 13 · 3.1 ft every 4 s, short, steep chop. The color key is folded away at the bottom.</w:t>
+      </w:r>
+    </w:p>
+    <w:p>
+      <w:pPr>
+        <w:pStyle w:val="ListBullet"/>
+      </w:pPr>
+      <w:r>
+        <w:rPr>
+          <w:b/>
+        </w:rPr>
+        <w:t>Plays forward 72 hours.</w:t>
+      </w:r>
+      <w:r>
+        <w:t xml:space="preserve"> Press ▶, or drag the slider to an hour: good for seeing when the chop lies down.</w:t>
+      </w:r>
+    </w:p>
+    <w:p>
+      <w:pPr>
+        <w:pStyle w:val="ListBullet"/>
+      </w:pPr>
+      <w:r>
+        <w:rPr>
+          <w:b/>
+        </w:rPr>
+        <w:t>The color key folds away.</w:t>
+      </w:r>
+      <w:r>
+        <w:t xml:space="preserve"> Tap it and it shrinks to its title (as above), so it doesn't cover the map. The app remembers this on each phone.</w:t>
+      </w:r>
+    </w:p>
+    <w:p>
+      <w:pPr>
+        <w:pStyle w:val="ListBullet"/>
+      </w:pPr>
+      <w:r>
+        <w:rPr>
+          <w:b/>
+        </w:rPr>
+        <w:t>Colors follow each sailor's own limits:</w:t>
+      </w:r>
+      <w:r>
+        <w:t xml:space="preserve"> green is their range, red is over their limit for their boat.</w:t>
+      </w:r>
+    </w:p>
+    <w:p>
+      <w:pPr>
+        <w:pStyle w:val="Heading2"/>
+      </w:pPr>
+      <w:r>
+        <w:t>4. The Captain's Daily Brief, live today</w:t>
+      </w:r>
+    </w:p>
+    <w:p>
+      <w:r>
+        <w:t xml:space="preserve">Hand-checked news that affects boaters: bridge and channel work, Coast Guard rule changes, marina deals, boat shows, regattas and festivals. The top items near the sailor's marina appear right under the score, Safety first, and the </w:t>
+      </w:r>
+      <w:r>
+        <w:rPr>
+          <w:b/>
+        </w:rPr>
+        <w:t>Brief</w:t>
+      </w:r>
+      <w:r>
+        <w:t xml:space="preserve"> tab has the rest. In Galveston today, two Safety items show up within 2 miles.</w:t>
+      </w:r>
+    </w:p>
+    <w:tbl>
+      <w:tblPr>
+        <w:tblW w:type="auto" w:w="0"/>
+        <w:tblLook w:firstColumn="1" w:firstRow="1" w:lastColumn="0" w:lastRow="0" w:noHBand="0" w:noVBand="1" w:val="04A0"/>
+      </w:tblPr>
+      <w:tblGrid>
+        <w:gridCol w:w="4320"/>
+        <w:gridCol w:w="4320"/>
+      </w:tblGrid>
+      <w:tr>
+        <w:tc>
+          <w:tcPr>
+            <w:tcW w:type="dxa" w:w="4320"/>
+          </w:tcPr>
+          <w:p>
+            <w:pPr>
+              <w:jc w:val="center"/>
+            </w:pPr>
+            <w:r>
+              <w:drawing>
+                <wp:inline xmlns:a="http://schemas.openxmlformats.org/drawingml/2006/main" xmlns:pic="http://schemas.openxmlformats.org/drawingml/2006/picture">
+                  <wp:extent cx="1965960" cy="3961409"/>
+                  <wp:docPr id="7" name="Picture 7"/>
+                  <wp:cNvGraphicFramePr>
+                    <a:graphicFrameLocks noChangeAspect="1"/>
+                  </wp:cNvGraphicFramePr>
+                  <a:graphic>
+                    <a:graphicData uri="http://schemas.openxmlformats.org/drawingml/2006/picture">
+                      <pic:pic>
+                        <pic:nvPicPr>
+                          <pic:cNvPr id="0" name="brief-strip.jpg"/>
+                          <pic:cNvPicPr/>
+                        </pic:nvPicPr>
+                        <pic:blipFill>
+                          <a:blip r:embed="rId15"/>
+                          <a:stretch>
+                            <a:fillRect/>
+                          </a:stretch>
+                        </pic:blipFill>
+                        <pic:spPr>
+                          <a:xfrm>
+                            <a:off x="0" y="0"/>
+                            <a:ext cx="1965960" cy="3961409"/>
+                          </a:xfrm>
+                          <a:prstGeom prst="rect"/>
+                        </pic:spPr>
+                      </pic:pic>
+                    </a:graphicData>
+                  </a:graphic>
+                </wp:inline>
+              </w:drawing>
+            </w:r>
+          </w:p>
+          <w:p>
+            <w:pPr>
+              <w:jc w:val="center"/>
+            </w:pPr>
+            <w:r>
+              <w:rPr>
+                <w:i/>
+                <w:color w:val="555555"/>
+                <w:sz w:val="18"/>
+              </w:rPr>
+              <w:t>On the Today screen, under the score</w:t>
+            </w:r>
+          </w:p>
+        </w:tc>
+        <w:tc>
+          <w:tcPr>
+            <w:tcW w:type="dxa" w:w="4320"/>
+          </w:tcPr>
+          <w:p>
+            <w:pPr>
+              <w:jc w:val="center"/>
+            </w:pPr>
+            <w:r>
+              <w:drawing>
+                <wp:inline xmlns:a="http://schemas.openxmlformats.org/drawingml/2006/main" xmlns:pic="http://schemas.openxmlformats.org/drawingml/2006/picture">
+                  <wp:extent cx="1965960" cy="4256303"/>
+                  <wp:docPr id="8" name="Picture 8"/>
+                  <wp:cNvGraphicFramePr>
+                    <a:graphicFrameLocks noChangeAspect="1"/>
+                  </wp:cNvGraphicFramePr>
+                  <a:graphic>
+                    <a:graphicData uri="http://schemas.openxmlformats.org/drawingml/2006/picture">
+                      <pic:pic>
+                        <pic:nvPicPr>
+                          <pic:cNvPr id="0" name="brief-tab.jpg"/>
+                          <pic:cNvPicPr/>
+                        </pic:nvPicPr>
+                        <pic:blipFill>
+                          <a:blip r:embed="rId16"/>
+                          <a:stretch>
+                            <a:fillRect/>
+                          </a:stretch>
+                        </pic:blipFill>
+                        <pic:spPr>
+                          <a:xfrm>
+                            <a:off x="0" y="0"/>
+                            <a:ext cx="1965960" cy="4256303"/>
+                          </a:xfrm>
+                          <a:prstGeom prst="rect"/>
+                        </pic:spPr>
+                      </pic:pic>
+                    </a:graphicData>
+                  </a:graphic>
+                </wp:inline>
+              </w:drawing>
+            </w:r>
+          </w:p>
+          <w:p>
+            <w:pPr>
+              <w:jc w:val="center"/>
+            </w:pPr>
+            <w:r>
+              <w:rPr>
+                <w:i/>
+                <w:color w:val="555555"/>
+                <w:sz w:val="18"/>
+              </w:rPr>
+              <w:t>The full Brief, with a Captain's note and source</w:t>
+            </w:r>
+          </w:p>
+        </w:tc>
+      </w:tr>
+    </w:tbl>
+    <w:p>
+      <w:pPr>
+        <w:pStyle w:val="Heading2"/>
+      </w:pPr>
+      <w:r>
+        <w:t>5. Also in the app</w:t>
+      </w:r>
+    </w:p>
+    <w:p>
+      <w:pPr>
+        <w:pStyle w:val="ListBullet"/>
+      </w:pPr>
+      <w:r>
+        <w:rPr>
+          <w:b/>
+        </w:rPr>
+        <w:t>Sailing Window score (0–10)</w:t>
+      </w:r>
+      <w:r>
+        <w:t xml:space="preserve"> with the best departure and return times for the trip length you choose, and plain-English reasons.</w:t>
       </w:r>
     </w:p>
     <w:p>
@@ -157,7 +883,7 @@
         <w:t>Live data:</w:t>
       </w:r>
       <w:r>
-        <w:t xml:space="preserve"> National Weather Service hourly forecasts, NOAA tide predictions from 35 verified tide stations, and the ECMWF model for the 7-day outlook, plus wave height and wave period from a commercial marine forecast service.</w:t>
+        <w:t xml:space="preserve"> National Weather Service, NOAA tides from 35 stations, and the ECMWF model for the 7-day outlook, plus a commercial marine wave forecast.</w:t>
       </w:r>
     </w:p>
     <w:p>
@@ -168,10 +894,10 @@
         <w:rPr>
           <w:b/>
         </w:rPr>
-        <w:t>Wind and tide charts</w:t>
+        <w:t>7-Day Forecast</w:t>
       </w:r>
       <w:r>
-        <w:t xml:space="preserve"> with the best window shaded, and a high/low tide table.</w:t>
+        <w:t xml:space="preserve"> with a score for each day.</w:t>
       </w:r>
     </w:p>
     <w:p>
@@ -182,10 +908,28 @@
         <w:rPr>
           <w:b/>
         </w:rPr>
-        <w:t>7-Day Forecast:</w:t>
+        <w:t>80+ Gulf marinas</w:t>
       </w:r>
       <w:r>
-        <w:t xml:space="preserve"> a sailability score and best window for each day of the coming week.</w:t>
+        <w:t xml:space="preserve"> with tap-to-call numbers, </w:t>
+      </w:r>
+      <w:r>
+        <w:rPr>
+          <w:b/>
+        </w:rPr>
+        <w:t>restaurants within walking distance</w:t>
+      </w:r>
+      <w:r>
+        <w:t xml:space="preserve">, and </w:t>
+      </w:r>
+      <w:r>
+        <w:rPr>
+          <w:b/>
+        </w:rPr>
+        <w:t>48 drawbridges</w:t>
+      </w:r>
+      <w:r>
+        <w:t xml:space="preserve"> with VHF channels, clearances and schedules.</w:t>
       </w:r>
     </w:p>
     <w:p>
@@ -196,80 +940,10 @@
         <w:rPr>
           <w:b/>
         </w:rPr>
-        <w:t>Wind Map:</w:t>
+        <w:t>Cruiser's Log</w:t>
       </w:r>
       <w:r>
-        <w:t xml:space="preserve"> three days of wind, gusts and waves across the coast. Tap any spot on the water for instant readings (details below).</w:t>
-      </w:r>
-    </w:p>
-    <w:p>
-      <w:pPr>
-        <w:pStyle w:val="ListBullet"/>
-      </w:pPr>
-      <w:r>
-        <w:rPr>
-          <w:b/>
-        </w:rPr>
-        <w:t>Marinas:</w:t>
-      </w:r>
-      <w:r>
-        <w:t xml:space="preserve"> 80+ curated Gulf marinas with tap-to-call phone numbers, on a searchable list and map, plus nearby marinas found live wherever you are.</w:t>
-      </w:r>
-    </w:p>
-    <w:p>
-      <w:pPr>
-        <w:pStyle w:val="ListBullet"/>
-      </w:pPr>
-      <w:r>
-        <w:rPr>
-          <w:b/>
-        </w:rPr>
-        <w:t>Dining ashore:</w:t>
-      </w:r>
-      <w:r>
-        <w:t xml:space="preserve"> restaurants within walking distance of the marina you pull into.</w:t>
-      </w:r>
-    </w:p>
-    <w:p>
-      <w:pPr>
-        <w:pStyle w:val="ListBullet"/>
-      </w:pPr>
-      <w:r>
-        <w:rPr>
-          <w:b/>
-        </w:rPr>
-        <w:t>Drawbridges:</w:t>
-      </w:r>
-      <w:r>
-        <w:t xml:space="preserve"> 48 drawbridges with VHF channels, clearances and opening schedules, and the bridges near your location.</w:t>
-      </w:r>
-    </w:p>
-    <w:p>
-      <w:pPr>
-        <w:pStyle w:val="ListBullet"/>
-      </w:pPr>
-      <w:r>
-        <w:rPr>
-          <w:b/>
-        </w:rPr>
-        <w:t>Cruiser's Log:</w:t>
-      </w:r>
-      <w:r>
-        <w:t xml:space="preserve"> log your trips and read reports from other sailors on docking, restaurants and hazards. Every post is checked by hand before it appears.</w:t>
-      </w:r>
-    </w:p>
-    <w:p>
-      <w:pPr>
-        <w:pStyle w:val="ListBullet"/>
-      </w:pPr>
-      <w:r>
-        <w:rPr>
-          <w:b/>
-        </w:rPr>
-        <w:t>Captain's Brief (rolling out now):</w:t>
-      </w:r>
-      <w:r>
-        <w:t xml:space="preserve"> hand-checked news that affects boaters. Bridge and channel work, Coast Guard rule changes, marina deals, boat shows and festivals, with the most important items near you shown right under your score.</w:t>
+        <w:t xml:space="preserve"> with trip reports from other sailors, each checked by hand before it appears.</w:t>
       </w:r>
     </w:p>
     <w:p>
@@ -283,309 +957,7 @@
         <w:t>Weak-signal help:</w:t>
       </w:r>
       <w:r>
-        <w:t xml:space="preserve"> if the cell signal drops, the app keeps your last forecast on screen and walks you through switching to the boat's Starlink or marina Wi-Fi.</w:t>
-      </w:r>
-    </w:p>
-    <w:p>
-      <w:pPr>
-        <w:pStyle w:val="Heading2"/>
-      </w:pPr>
-      <w:r>
-        <w:t>New for multihull sailors: Boat Type</w:t>
-      </w:r>
-    </w:p>
-    <w:p>
-      <w:r>
-        <w:t xml:space="preserve">In </w:t>
-      </w:r>
-      <w:r>
-        <w:rPr>
-          <w:b/>
-        </w:rPr>
-        <w:t>Sailing Preferences</w:t>
-      </w:r>
-      <w:r>
-        <w:t xml:space="preserve">, choose </w:t>
-      </w:r>
-      <w:r>
-        <w:rPr>
-          <w:b/>
-        </w:rPr>
-        <w:t>Monohull, Catamaran, Trimaran or Beach Cat</w:t>
-      </w:r>
-      <w:r>
-        <w:t>. The whole app then reads the same forecast the way your boat experiences it.</w:t>
-      </w:r>
-    </w:p>
-    <w:p>
-      <w:r>
-        <w:rPr>
-          <w:b/>
-        </w:rPr>
-        <w:t>Why it matters:</w:t>
-      </w:r>
-      <w:r>
-        <w:t xml:space="preserve"> a monohull heels and spills a gust, so the skipper feels it coming. A multihull stays flat and takes the full load. For multihulls the </w:t>
-      </w:r>
-      <w:r>
-        <w:rPr>
-          <w:i/>
-        </w:rPr>
-        <w:t>gap</w:t>
-      </w:r>
-      <w:r>
-        <w:t xml:space="preserve"> between steady wind and gusts matters more than the average wind. And a catamaran's bridgedeck pounds in short, steep chop that a monohull shrugs off.</w:t>
-      </w:r>
-    </w:p>
-    <w:p>
-      <w:pPr>
-        <w:pStyle w:val="Heading3"/>
-      </w:pPr>
-      <w:r>
-        <w:t>Monohull (the baseline)</w:t>
-      </w:r>
-    </w:p>
-    <w:p>
-      <w:pPr>
-        <w:pStyle w:val="ListBullet"/>
-      </w:pPr>
-      <w:r>
-        <w:t xml:space="preserve">Gustiness starts lowering the score once gusts run </w:t>
-      </w:r>
-      <w:r>
-        <w:rPr>
-          <w:b/>
-        </w:rPr>
-        <w:t>7 kt or more</w:t>
-      </w:r>
-      <w:r>
-        <w:t xml:space="preserve"> above the steady wind.</w:t>
-      </w:r>
-    </w:p>
-    <w:p>
-      <w:pPr>
-        <w:pStyle w:val="ListBullet"/>
-      </w:pPr>
-      <w:r>
-        <w:t xml:space="preserve">Automatic no-go above </w:t>
-      </w:r>
-      <w:r>
-        <w:rPr>
-          <w:b/>
-        </w:rPr>
-        <w:t>26 kt</w:t>
-      </w:r>
-      <w:r>
-        <w:t xml:space="preserve"> of wind.</w:t>
-      </w:r>
-    </w:p>
-    <w:p>
-      <w:pPr>
-        <w:pStyle w:val="ListBullet"/>
-      </w:pPr>
-      <w:r>
-        <w:t>Waves count at normal weight.</w:t>
-      </w:r>
-    </w:p>
-    <w:p>
-      <w:pPr>
-        <w:pStyle w:val="Heading3"/>
-      </w:pPr>
-      <w:r>
-        <w:t>Catamaran (cruising cats such as Seawind)</w:t>
-      </w:r>
-    </w:p>
-    <w:p>
-      <w:pPr>
-        <w:pStyle w:val="ListBullet"/>
-      </w:pPr>
-      <w:r>
-        <w:t xml:space="preserve">Gustiness starts counting at a </w:t>
-      </w:r>
-      <w:r>
-        <w:rPr>
-          <w:b/>
-        </w:rPr>
-        <w:t>5 kt</w:t>
-      </w:r>
-      <w:r>
-        <w:t xml:space="preserve"> gust spread, and costs more per knot than for a monohull.</w:t>
-      </w:r>
-    </w:p>
-    <w:p>
-      <w:pPr>
-        <w:pStyle w:val="ListBullet"/>
-      </w:pPr>
-      <w:r>
-        <w:t xml:space="preserve">Automatic no-go above </w:t>
-      </w:r>
-      <w:r>
-        <w:rPr>
-          <w:b/>
-        </w:rPr>
-        <w:t>26 kt</w:t>
-      </w:r>
-      <w:r>
-        <w:t>.</w:t>
-      </w:r>
-    </w:p>
-    <w:p>
-      <w:pPr>
-        <w:pStyle w:val="ListBullet"/>
-      </w:pPr>
-      <w:r>
-        <w:t xml:space="preserve">Waves count </w:t>
-      </w:r>
-      <w:r>
-        <w:rPr>
-          <w:b/>
-        </w:rPr>
-        <w:t>1.5 times</w:t>
-      </w:r>
-      <w:r>
-        <w:t xml:space="preserve"> as much, because short, steep chop is what makes a cat pound.</w:t>
-      </w:r>
-    </w:p>
-    <w:p>
-      <w:pPr>
-        <w:pStyle w:val="ListBullet"/>
-      </w:pPr>
-      <w:r>
-        <w:t>An extra reason tag warns when it's "Gusty for a catamaran."</w:t>
-      </w:r>
-    </w:p>
-    <w:p>
-      <w:pPr>
-        <w:pStyle w:val="Heading3"/>
-      </w:pPr>
-      <w:r>
-        <w:t>Trimaran (performance tris such as Corsair and Dragonfly)</w:t>
-      </w:r>
-    </w:p>
-    <w:p>
-      <w:pPr>
-        <w:pStyle w:val="ListBullet"/>
-      </w:pPr>
-      <w:r>
-        <w:t>The same stricter gust handling as a catamaran.</w:t>
-      </w:r>
-    </w:p>
-    <w:p>
-      <w:pPr>
-        <w:pStyle w:val="ListBullet"/>
-      </w:pPr>
-      <w:r>
-        <w:t xml:space="preserve">Automatic no-go above </w:t>
-      </w:r>
-      <w:r>
-        <w:rPr>
-          <w:b/>
-        </w:rPr>
-        <w:t>24 kt</w:t>
-      </w:r>
-      <w:r>
-        <w:t xml:space="preserve"> of wind.</w:t>
-      </w:r>
-    </w:p>
-    <w:p>
-      <w:pPr>
-        <w:pStyle w:val="ListBullet"/>
-      </w:pPr>
-      <w:r>
-        <w:t xml:space="preserve">Waves count </w:t>
-      </w:r>
-      <w:r>
-        <w:rPr>
-          <w:b/>
-        </w:rPr>
-        <w:t>1.3 times</w:t>
-      </w:r>
-      <w:r>
-        <w:t xml:space="preserve"> as much.</w:t>
-      </w:r>
-    </w:p>
-    <w:p>
-      <w:pPr>
-        <w:pStyle w:val="Heading3"/>
-      </w:pPr>
-      <w:r>
-        <w:t>Beach Cat</w:t>
-      </w:r>
-    </w:p>
-    <w:p>
-      <w:pPr>
-        <w:pStyle w:val="ListBullet"/>
-      </w:pPr>
-      <w:r>
-        <w:t xml:space="preserve">The strictest gust handling: counts from a </w:t>
-      </w:r>
-      <w:r>
-        <w:rPr>
-          <w:b/>
-        </w:rPr>
-        <w:t>4 kt</w:t>
-      </w:r>
-      <w:r>
-        <w:t xml:space="preserve"> spread.</w:t>
-      </w:r>
-    </w:p>
-    <w:p>
-      <w:pPr>
-        <w:pStyle w:val="ListBullet"/>
-      </w:pPr>
-      <w:r>
-        <w:t xml:space="preserve">Automatic no-go above </w:t>
-      </w:r>
-      <w:r>
-        <w:rPr>
-          <w:b/>
-        </w:rPr>
-        <w:t>20 kt</w:t>
-      </w:r>
-      <w:r>
-        <w:t xml:space="preserve"> of wind, and in seas of </w:t>
-      </w:r>
-      <w:r>
-        <w:rPr>
-          <w:b/>
-        </w:rPr>
-        <w:t>4 ft or more</w:t>
-      </w:r>
-      <w:r>
-        <w:t>.</w:t>
-      </w:r>
-    </w:p>
-    <w:p>
-      <w:pPr>
-        <w:pStyle w:val="ListBullet"/>
-      </w:pPr>
-      <w:r>
-        <w:t xml:space="preserve">Waves count </w:t>
-      </w:r>
-      <w:r>
-        <w:rPr>
-          <w:b/>
-        </w:rPr>
-        <w:t>twice</w:t>
-      </w:r>
-      <w:r>
-        <w:t xml:space="preserve"> as much.</w:t>
-      </w:r>
-    </w:p>
-    <w:p>
-      <w:pPr>
-        <w:pStyle w:val="ListBullet"/>
-      </w:pPr>
-      <w:r>
-        <w:t>Choosing Beach Cat suggests gentler limits (6–15 kt wind, 18 kt maximum gust), which you can still adjust.</w:t>
-      </w:r>
-    </w:p>
-    <w:p>
-      <w:pPr>
-        <w:pStyle w:val="Heading3"/>
-      </w:pPr>
-      <w:r>
-        <w:t>Real examples (same forecast, different boats)</w:t>
+        <w:t xml:space="preserve"> if the cell signal drops offshore, the app keeps the last forecast up and walks the skipper through switching to the boat's Starlink or marina Wi-Fi.</w:t>
       </w:r>
     </w:p>
     <w:p>
@@ -596,363 +968,10 @@
         <w:rPr>
           <w:b/>
         </w:rPr>
-        <w:t>12 kt gusting 20 kt:</w:t>
+        <w:t>Works on any phone</w:t>
       </w:r>
       <w:r>
-        <w:t xml:space="preserve"> Monohull 8.1 · Catamaran 6.7 · Trimaran 6.7 · Beach Cat 5.3</w:t>
-      </w:r>
-    </w:p>
-    <w:p>
-      <w:pPr>
-        <w:pStyle w:val="ListBullet"/>
-      </w:pPr>
-      <w:r>
-        <w:rPr>
-          <w:b/>
-        </w:rPr>
-        <w:t>3 ft seas, 4 seconds apart (short, steep chop):</w:t>
-      </w:r>
-      <w:r>
-        <w:t xml:space="preserve"> Monohull 6.9 · Catamaran 6.1 · Trimaran 6.4 · Beach Cat 5.3</w:t>
-      </w:r>
-    </w:p>
-    <w:p>
-      <w:pPr>
-        <w:pStyle w:val="ListBullet"/>
-      </w:pPr>
-      <w:r>
-        <w:rPr>
-          <w:b/>
-        </w:rPr>
-        <w:t>3 ft seas, 9 seconds apart (gentle swell):</w:t>
-      </w:r>
-      <w:r>
-        <w:t xml:space="preserve"> Monohull 7.9 · Catamaran 7.6 · Trimaran 7.7 · Beach Cat 7.3</w:t>
-      </w:r>
-    </w:p>
-    <w:p>
-      <w:r>
-        <w:t xml:space="preserve">The two sea-state examples have the same wave height. Only the </w:t>
-      </w:r>
-      <w:r>
-        <w:rPr>
-          <w:i/>
-        </w:rPr>
-        <w:t>period</w:t>
-      </w:r>
-      <w:r>
-        <w:t xml:space="preserve"> differs, and the multihull scores show it.</w:t>
-      </w:r>
-    </w:p>
-    <w:p>
-      <w:r>
-        <w:rPr>
-          <w:b/>
-        </w:rPr>
-        <w:t>Note:</w:t>
-      </w:r>
-      <w:r>
-        <w:t xml:space="preserve"> these limits are a careful starting point. We would welcome Windcraft's guidance on the right wind range, gust limit and "stay in" wind speed for new owners of each type, and will update the app to match.</w:t>
-      </w:r>
-    </w:p>
-    <w:p>
-      <w:pPr>
-        <w:pStyle w:val="Heading2"/>
-      </w:pPr>
-      <w:r>
-        <w:t>The Wind Map: wind, gusts and waves</w:t>
-      </w:r>
-    </w:p>
-    <w:p>
-      <w:r>
-        <w:t xml:space="preserve">Tap </w:t>
-      </w:r>
-      <w:r>
-        <w:rPr>
-          <w:b/>
-        </w:rPr>
-        <w:t>Wind</w:t>
-      </w:r>
-      <w:r>
-        <w:t xml:space="preserve"> in the bottom bar. The map opens on your chosen marina, at a scale that shows roughly 50 miles of coast, so you see where you are right away.</w:t>
-      </w:r>
-    </w:p>
-    <w:p>
-      <w:r>
-        <w:rPr>
-          <w:b/>
-        </w:rPr>
-        <w:t>Tap anywhere on the water for instant details.</w:t>
-      </w:r>
-      <w:r>
-        <w:t xml:space="preserve"> On every layer (Wind, Gusts or Waves), one tap on any spot shows a pop-up with that exact spot's wind speed and direction, gusts, wave height and how many seconds apart the waves are. For example: "14 kt NE · gust 19" and "2.2 ft every 4 s · short, steep chop." Tap another spot to compare, or drag the time slider and the readout updates for that hour.</w:t>
-      </w:r>
-    </w:p>
-    <w:p>
-      <w:pPr>
-        <w:pStyle w:val="Heading3"/>
-      </w:pPr>
-      <w:r>
-        <w:t>Three layers</w:t>
-      </w:r>
-    </w:p>
-    <w:p>
-      <w:pPr>
-        <w:pStyle w:val="ListBullet"/>
-      </w:pPr>
-      <w:r>
-        <w:rPr>
-          <w:b/>
-        </w:rPr>
-        <w:t>Wind:</w:t>
-      </w:r>
-      <w:r>
-        <w:t xml:space="preserve"> steady wind speed, with moving streaks showing direction. Longer streaks mean stronger wind.</w:t>
-      </w:r>
-    </w:p>
-    <w:p>
-      <w:pPr>
-        <w:pStyle w:val="ListBullet"/>
-      </w:pPr>
-      <w:r>
-        <w:rPr>
-          <w:b/>
-        </w:rPr>
-        <w:t>Gusts:</w:t>
-      </w:r>
-      <w:r>
-        <w:t xml:space="preserve"> peak gusts, colored against </w:t>
-      </w:r>
-      <w:r>
-        <w:rPr>
-          <w:i/>
-        </w:rPr>
-        <w:t>your</w:t>
-      </w:r>
-      <w:r>
-        <w:t xml:space="preserve"> gust limit, so red means over your limit, not someone else's.</w:t>
-      </w:r>
-    </w:p>
-    <w:p>
-      <w:pPr>
-        <w:pStyle w:val="ListBullet"/>
-      </w:pPr>
-      <w:r>
-        <w:rPr>
-          <w:b/>
-        </w:rPr>
-        <w:t>Waves:</w:t>
-      </w:r>
-      <w:r>
-        <w:t xml:space="preserve"> wave height across the water. For multihulls this layer becomes </w:t>
-      </w:r>
-      <w:r>
-        <w:rPr>
-          <w:b/>
-        </w:rPr>
-        <w:t>Sea state</w:t>
-      </w:r>
-      <w:r>
-        <w:t xml:space="preserve"> (see below).</w:t>
-      </w:r>
-    </w:p>
-    <w:p>
-      <w:pPr>
-        <w:pStyle w:val="Heading3"/>
-      </w:pPr>
-      <w:r>
-        <w:t>Colors follow your boat</w:t>
-      </w:r>
-    </w:p>
-    <w:p>
-      <w:pPr>
-        <w:pStyle w:val="ListBullet"/>
-      </w:pPr>
-      <w:r>
-        <w:t>Green is your preferred range. Red is a no-go for your boat type: over 26 kt for a monohull or catamaran, 24 kt for a trimaran, 20 kt for a beach cat.</w:t>
-      </w:r>
-    </w:p>
-    <w:p>
-      <w:pPr>
-        <w:pStyle w:val="ListBullet"/>
-      </w:pPr>
-      <w:r>
-        <w:t>Change your limits or boat type in Sailing Preferences, and the map recolors to match.</w:t>
-      </w:r>
-    </w:p>
-    <w:p>
-      <w:pPr>
-        <w:pStyle w:val="Heading3"/>
-      </w:pPr>
-      <w:r>
-        <w:t>Sea state for multihulls</w:t>
-      </w:r>
-    </w:p>
-    <w:p>
-      <w:r>
-        <w:t xml:space="preserve">For a catamaran, trimaran or beach cat, the Waves layer shows how the sea will </w:t>
-      </w:r>
-      <w:r>
-        <w:rPr>
-          <w:i/>
-        </w:rPr>
-        <w:t>feel</w:t>
-      </w:r>
-      <w:r>
-        <w:t>, not height alone:</w:t>
-      </w:r>
-    </w:p>
-    <w:p>
-      <w:pPr>
-        <w:pStyle w:val="ListBullet"/>
-      </w:pPr>
-      <w:r>
-        <w:rPr>
-          <w:b/>
-        </w:rPr>
-        <w:t>Blue:</w:t>
-      </w:r>
-      <w:r>
-        <w:t xml:space="preserve"> under 1 ft, flat.</w:t>
-      </w:r>
-    </w:p>
-    <w:p>
-      <w:pPr>
-        <w:pStyle w:val="ListBullet"/>
-      </w:pPr>
-      <w:r>
-        <w:rPr>
-          <w:b/>
-        </w:rPr>
-        <w:t>Green:</w:t>
-      </w:r>
-      <w:r>
-        <w:t xml:space="preserve"> 1–2 ft, easy.</w:t>
-      </w:r>
-    </w:p>
-    <w:p>
-      <w:pPr>
-        <w:pStyle w:val="ListBullet"/>
-      </w:pPr>
-      <w:r>
-        <w:rPr>
-          <w:b/>
-        </w:rPr>
-        <w:t>Yellow:</w:t>
-      </w:r>
-      <w:r>
-        <w:t xml:space="preserve"> 2–4 ft, or choppy.</w:t>
-      </w:r>
-    </w:p>
-    <w:p>
-      <w:pPr>
-        <w:pStyle w:val="ListBullet"/>
-      </w:pPr>
-      <w:r>
-        <w:rPr>
-          <w:b/>
-        </w:rPr>
-        <w:t>Orange:</w:t>
-      </w:r>
-      <w:r>
-        <w:t xml:space="preserve"> short, steep chop, bridgedeck slam.</w:t>
-      </w:r>
-    </w:p>
-    <w:p>
-      <w:pPr>
-        <w:pStyle w:val="ListBullet"/>
-      </w:pPr>
-      <w:r>
-        <w:rPr>
-          <w:b/>
-        </w:rPr>
-        <w:t>Red:</w:t>
-      </w:r>
-      <w:r>
-        <w:t xml:space="preserve"> over 6 ft, or steep seas of 4 ft or more.</w:t>
-      </w:r>
-    </w:p>
-    <w:p>
-      <w:r>
-        <w:t>Waves of 1.5 ft or more that arrive less than 5 seconds apart move up a full color, and less than 6 seconds apart move up half a color. So a stretch of water a monohull sailor sees as a moderate yellow can show orange for a catamaran. That's the point: same sea, different boat.</w:t>
-      </w:r>
-    </w:p>
-    <w:p>
-      <w:pPr>
-        <w:pStyle w:val="Heading3"/>
-      </w:pPr>
-      <w:r>
-        <w:t>How to use it</w:t>
-      </w:r>
-    </w:p>
-    <w:p>
-      <w:pPr>
-        <w:pStyle w:val="ListBullet"/>
-      </w:pPr>
-      <w:r>
-        <w:rPr>
-          <w:b/>
-        </w:rPr>
-        <w:t>Tap any spot on the water, on any layer,</w:t>
-      </w:r>
-      <w:r>
-        <w:t xml:space="preserve"> for instant wind, gusts, wave height and wave period at that exact spot. Check the bay, the pass and offshore in three taps before you leave the dock.</w:t>
-      </w:r>
-    </w:p>
-    <w:p>
-      <w:pPr>
-        <w:pStyle w:val="ListBullet"/>
-      </w:pPr>
-      <w:r>
-        <w:rPr>
-          <w:b/>
-        </w:rPr>
-        <w:t>Press ▶</w:t>
-      </w:r>
-      <w:r>
-        <w:t xml:space="preserve"> to play the next 72 hours, or drag the slider to a particular hour. Good for timing a passage or seeing when the chop lies down.</w:t>
-      </w:r>
-    </w:p>
-    <w:p>
-      <w:pPr>
-        <w:pStyle w:val="ListBullet"/>
-      </w:pPr>
-      <w:r>
-        <w:rPr>
-          <w:b/>
-        </w:rPr>
-        <w:t>Jump to…</w:t>
-      </w:r>
-      <w:r>
-        <w:t xml:space="preserve"> moves the map to any marina on the list.</w:t>
-      </w:r>
-    </w:p>
-    <w:p>
-      <w:pPr>
-        <w:pStyle w:val="ListBullet"/>
-      </w:pPr>
-      <w:r>
-        <w:rPr>
-          <w:b/>
-        </w:rPr>
-        <w:t>The color key folds away.</w:t>
-      </w:r>
-      <w:r>
-        <w:t xml:space="preserve"> Tap the key in the bottom-left corner to shrink it to its title, so it stops covering the map, and tap again to bring it back. The app remembers your choice on that device.</w:t>
-      </w:r>
-    </w:p>
-    <w:p>
-      <w:pPr>
-        <w:pStyle w:val="ListBullet"/>
-      </w:pPr>
-      <w:r>
-        <w:rPr>
-          <w:b/>
-        </w:rPr>
-        <w:t>A planning tool:</w:t>
-      </w:r>
-      <w:r>
-        <w:t xml:space="preserve"> wave data comes from the nearest open water, so a sheltered bay can be calmer than shown. Always check official forecasts before you sail.</w:t>
+        <w:t>, nothing to install, Texas to the Florida Keys. 7-day free trial, then $5.99 a month or $49 a year.</w:t>
       </w:r>
     </w:p>
     <w:p>
@@ -988,9 +1007,6 @@
           <w:b/>
         </w:rPr>
         <w:t>"Sailing Today? Ask Captain Jim."</w:t>
-      </w:r>
-      <w:r>
-        <w:t xml:space="preserve"> The 7-day trial starts automatically.</w:t>
       </w:r>
     </w:p>
     <w:p>
@@ -1062,7 +1078,7 @@
         </w:numPr>
       </w:pPr>
       <w:r>
-        <w:t xml:space="preserve">Read your score and the reason tags, then tap </w:t>
+        <w:t xml:space="preserve">Tap </w:t>
       </w:r>
       <w:r>
         <w:rPr>
@@ -1071,7 +1087,7 @@
         <w:t>Wind</w:t>
       </w:r>
       <w:r>
-        <w:t xml:space="preserve"> in the bottom bar and switch to </w:t>
+        <w:t xml:space="preserve"> at the bottom, then </w:t>
       </w:r>
       <w:r>
         <w:rPr>
@@ -1080,7 +1096,15 @@
         <w:t>Waves</w:t>
       </w:r>
       <w:r>
-        <w:t>.</w:t>
+        <w:t>, and tap a few spots on the bay and offshore.</w:t>
+      </w:r>
+    </w:p>
+    <w:p>
+      <w:pPr>
+        <w:pStyle w:val="Heading2"/>
+      </w:pPr>
+      <w:r>
+        <w:t>Two ways Windcraft could help</w:t>
       </w:r>
     </w:p>
     <w:p>
@@ -1088,32 +1112,35 @@
         <w:pStyle w:val="ListNumber"/>
         <w:numPr>
           <w:ilvl w:val="0"/>
-          <w:numId w:val="10"/>
+          <w:numId w:val="11"/>
         </w:numPr>
       </w:pPr>
       <w:r>
-        <w:t>Tap a few spots on the water, such as Pensacola Bay, the pass and offshore, and watch the readout change.</w:t>
+        <w:rPr>
+          <w:b/>
+        </w:rPr>
+        <w:t>Your numbers.</w:t>
+      </w:r>
+      <w:r>
+        <w:t xml:space="preserve"> The multihull limits are careful starting points. We'd much rather use Windcraft's: the wind range, gust limit and "stay in" wind speed you'd give a new owner of a cruising cat, a performance tri and a beach cat. And does "2 ft or more, under 5 seconds apart" match what makes a cat pound?</w:t>
       </w:r>
     </w:p>
     <w:p>
       <w:pPr>
-        <w:pStyle w:val="Heading2"/>
+        <w:pStyle w:val="ListNumber"/>
+        <w:numPr>
+          <w:ilvl w:val="0"/>
+          <w:numId w:val="11"/>
+        </w:numPr>
       </w:pPr>
       <w:r>
-        <w:t>Sharing with your customers</w:t>
+        <w:rPr>
+          <w:b/>
+        </w:rPr>
+        <w:t>Free access for your customers.</w:t>
       </w:r>
-    </w:p>
-    <w:p>
       <w:r>
-        <w:t>Ask Captain Jim is a good fit for Windcraft's new owners and family sailors. If you'd like to pass it along, we're glad to offer extended free access for your customers, or present it as a welcome gift from Windcraft.</w:t>
-      </w:r>
-    </w:p>
-    <w:p>
-      <w:pPr>
-        <w:pStyle w:val="Heading2"/>
-      </w:pPr>
-      <w:r>
-        <w:t>Contact</w:t>
+        <w:t xml:space="preserve"> We'd be glad to give Windcraft buyers, Seawind co-owners and anyone on your client list free access, presented as a welcome gift from Windcraft if you'd like. You could pass along this sheet or the link, and we'd take care of the rest.</w:t>
       </w:r>
     </w:p>
     <w:p>
@@ -1328,6 +1355,24 @@
       </w:pPr>
     </w:lvl>
   </w:abstractNum>
+  <w:abstractNum w:abstractNumId="10">
+    <w:nsid w:val="1A2B000A"/>
+    <w:multiLevelType w:val="singleLevel"/>
+    <w:tmpl w:val="D0A62B40"/>
+    <w:lvl w:ilvl="0">
+      <w:start w:val="1"/>
+      <w:numFmt w:val="decimal"/>
+      <w:pStyle w:val="ListNumber"/>
+      <w:lvlText w:val="%1."/>
+      <w:lvlJc w:val="left"/>
+      <w:pPr>
+        <w:tabs>
+          <w:tab w:val="num" w:pos="360"/>
+        </w:tabs>
+        <w:ind w:left="360" w:hanging="360"/>
+      </w:pPr>
+    </w:lvl>
+  </w:abstractNum>
   <w:num w:numId="1">
     <w:abstractNumId w:val="8"/>
   </w:num>
@@ -1357,6 +1402,9 @@
   </w:num>
   <w:num w:numId="10">
     <w:abstractNumId w:val="9"/>
+  </w:num>
+  <w:num w:numId="11">
+    <w:abstractNumId w:val="10"/>
   </w:num>
 </w:numbering>
 </file>

</xml_diff>